<commit_message>
Guia 5: run_all.sh, checklist de entrega y evidencia actualizada
- scripts/run_all.sh regenera todo en orden; las llamadas reales al LLM
  solo con --with-llm.
- evidence/README.md: checklist por criterio de evaluacion, pendientes del
  estudiante y datos clave para la sustentacion.

Co-Authored-By: Claude Opus 5.5 <noreply@anthropic.com>
</commit_message>
<xml_diff>
--- a/PROYECTO_FINAL/informe/Informe_Guia5_MecaTrack.docx
+++ b/PROYECTO_FINAL/informe/Informe_Guia5_MecaTrack.docx
@@ -4167,7 +4167,7 @@
           <w:sz w:val="14"/>
           <w:szCs w:val="14"/>
         </w:rPr>
-        <w:t xml:space="preserve"># Fecha:   2026-10-20 22:03:42 -05</w:t>
+        <w:t xml:space="preserve"># Fecha:   2026-10-20 22:30:20 -05</w:t>
       </w:r>
     </w:p>
     <w:p>
@@ -4182,7 +4182,7 @@
           <w:sz w:val="14"/>
           <w:szCs w:val="14"/>
         </w:rPr>
-        <w:t xml:space="preserve"># Commit:  ae4756e</w:t>
+        <w:t xml:space="preserve"># Commit:  48f3b74</w:t>
       </w:r>
     </w:p>
     <w:p>
@@ -4857,7 +4857,7 @@
           <w:sz w:val="14"/>
           <w:szCs w:val="14"/>
         </w:rPr>
-        <w:t xml:space="preserve">============================= 31 passed in 10.34s ==============================</w:t>
+        <w:t xml:space="preserve">============================= 31 passed in 10.42s ==============================</w:t>
       </w:r>
     </w:p>
     <w:p>
@@ -19248,7 +19248,7 @@
           <w:sz w:val="20"/>
           <w:szCs w:val="20"/>
         </w:rPr>
-        <w:t xml:space="preserve"> para esta guía: 713928b, bee0e88, d66da55, ae4756e, f1922cf, 776e54a, 8a61353, 246e698.</w:t>
+        <w:t xml:space="preserve"> para esta guía: 48f3b74, 713928b, bee0e88, d66da55, ae4756e, f1922cf, 776e54a, 8a61353, 246e698.</w:t>
       </w:r>
     </w:p>
     <w:p>

</xml_diff>